<commit_message>
Implemented ArrayGenerator according to the UML. Updated the project plan and UML to reflect changes.
</commit_message>
<xml_diff>
--- a/docs/proj_1_plan.docx
+++ b/docs/proj_1_plan.docx
@@ -1450,7 +1450,7 @@
               <w:rPr>
                 <w:rtl w:val="0"/>
               </w:rPr>
-              <w:t xml:space="preserve">IP</w:t>
+              <w:t xml:space="preserve">D</w:t>
             </w:r>
           </w:p>
         </w:tc>
@@ -1466,6 +1466,7 @@
               <w:rPr>
                 <w:rtl w:val="0"/>
               </w:rPr>
+              <w:t xml:space="preserve">docs/proj_1_plan.docx</w:t>
             </w:r>
           </w:p>
         </w:tc>
@@ -1550,7 +1551,7 @@
               <w:rPr>
                 <w:rtl w:val="0"/>
               </w:rPr>
-              <w:t xml:space="preserve">NS</w:t>
+              <w:t xml:space="preserve">IP</w:t>
             </w:r>
           </w:p>
         </w:tc>
@@ -2450,7 +2451,7 @@
               <w:rPr>
                 <w:rtl w:val="0"/>
               </w:rPr>
-              <w:t xml:space="preserve">IP</w:t>
+              <w:t xml:space="preserve">D</w:t>
             </w:r>
           </w:p>
         </w:tc>
@@ -2646,7 +2647,7 @@
               <w:rPr>
                 <w:rtl w:val="0"/>
               </w:rPr>
-              <w:t xml:space="preserve">NS</w:t>
+              <w:t xml:space="preserve">D</w:t>
             </w:r>
           </w:p>
         </w:tc>
@@ -4283,154 +4284,159 @@
               <w:rPr>
                 <w:rtl w:val="0"/>
               </w:rPr>
-            </w:r>
-          </w:p>
-        </w:tc>
-        <w:tc>
-          <w:tcPr>
-            <w:shd w:fill="auto" w:val="clear"/>
-            <w:tcMar>
-              <w:top w:w="100.0" w:type="dxa"/>
-              <w:left w:w="100.0" w:type="dxa"/>
-              <w:bottom w:w="100.0" w:type="dxa"/>
-              <w:right w:w="100.0" w:type="dxa"/>
-            </w:tcMar>
-            <w:vAlign w:val="top"/>
-          </w:tcPr>
-          <w:p>
-            <w:pPr>
-              <w:keepNext w:val="0"/>
-              <w:keepLines w:val="0"/>
-              <w:pageBreakBefore w:val="0"/>
-              <w:widowControl w:val="0"/>
-              <w:pBdr>
-                <w:top w:space="0" w:sz="0" w:val="nil"/>
-                <w:left w:space="0" w:sz="0" w:val="nil"/>
-                <w:bottom w:space="0" w:sz="0" w:val="nil"/>
-                <w:right w:space="0" w:sz="0" w:val="nil"/>
-                <w:between w:space="0" w:sz="0" w:val="nil"/>
-              </w:pBdr>
-              <w:shd w:fill="auto" w:val="clear"/>
-              <w:spacing w:after="0" w:before="0" w:line="240" w:lineRule="auto"/>
-              <w:ind w:left="0" w:right="0" w:firstLine="0"/>
-              <w:jc w:val="left"/>
-              <w:rPr/>
-            </w:pPr>
-            <w:r>
-              <w:rPr>
-                <w:rtl w:val="0"/>
-              </w:rPr>
-            </w:r>
-          </w:p>
-        </w:tc>
-        <w:tc>
-          <w:tcPr>
-            <w:shd w:fill="auto" w:val="clear"/>
-            <w:tcMar>
-              <w:top w:w="100.0" w:type="dxa"/>
-              <w:left w:w="100.0" w:type="dxa"/>
-              <w:bottom w:w="100.0" w:type="dxa"/>
-              <w:right w:w="100.0" w:type="dxa"/>
-            </w:tcMar>
-            <w:vAlign w:val="top"/>
-          </w:tcPr>
-          <w:p>
-            <w:pPr>
-              <w:keepNext w:val="0"/>
-              <w:keepLines w:val="0"/>
-              <w:pageBreakBefore w:val="0"/>
-              <w:widowControl w:val="0"/>
-              <w:pBdr>
-                <w:top w:space="0" w:sz="0" w:val="nil"/>
-                <w:left w:space="0" w:sz="0" w:val="nil"/>
-                <w:bottom w:space="0" w:sz="0" w:val="nil"/>
-                <w:right w:space="0" w:sz="0" w:val="nil"/>
-                <w:between w:space="0" w:sz="0" w:val="nil"/>
-              </w:pBdr>
-              <w:shd w:fill="auto" w:val="clear"/>
-              <w:spacing w:after="0" w:before="0" w:line="240" w:lineRule="auto"/>
-              <w:ind w:left="0" w:right="0" w:firstLine="0"/>
-              <w:jc w:val="left"/>
-              <w:rPr/>
-            </w:pPr>
-            <w:r>
-              <w:rPr>
-                <w:rtl w:val="0"/>
-              </w:rPr>
-            </w:r>
-          </w:p>
-        </w:tc>
-        <w:tc>
-          <w:tcPr>
-            <w:shd w:fill="auto" w:val="clear"/>
-            <w:tcMar>
-              <w:top w:w="100.0" w:type="dxa"/>
-              <w:left w:w="100.0" w:type="dxa"/>
-              <w:bottom w:w="100.0" w:type="dxa"/>
-              <w:right w:w="100.0" w:type="dxa"/>
-            </w:tcMar>
-            <w:vAlign w:val="top"/>
-          </w:tcPr>
-          <w:p>
-            <w:pPr>
-              <w:keepNext w:val="0"/>
-              <w:keepLines w:val="0"/>
-              <w:pageBreakBefore w:val="0"/>
-              <w:widowControl w:val="0"/>
-              <w:pBdr>
-                <w:top w:space="0" w:sz="0" w:val="nil"/>
-                <w:left w:space="0" w:sz="0" w:val="nil"/>
-                <w:bottom w:space="0" w:sz="0" w:val="nil"/>
-                <w:right w:space="0" w:sz="0" w:val="nil"/>
-                <w:between w:space="0" w:sz="0" w:val="nil"/>
-              </w:pBdr>
-              <w:shd w:fill="auto" w:val="clear"/>
-              <w:spacing w:after="0" w:before="0" w:line="240" w:lineRule="auto"/>
-              <w:ind w:left="0" w:right="0" w:firstLine="0"/>
-              <w:jc w:val="left"/>
-              <w:rPr/>
-            </w:pPr>
-            <w:r>
-              <w:rPr>
-                <w:rtl w:val="0"/>
-              </w:rPr>
-            </w:r>
-          </w:p>
-        </w:tc>
-        <w:tc>
-          <w:tcPr>
-            <w:shd w:fill="auto" w:val="clear"/>
-            <w:tcMar>
-              <w:top w:w="100.0" w:type="dxa"/>
-              <w:left w:w="100.0" w:type="dxa"/>
-              <w:bottom w:w="100.0" w:type="dxa"/>
-              <w:right w:w="100.0" w:type="dxa"/>
-            </w:tcMar>
-            <w:vAlign w:val="top"/>
-          </w:tcPr>
-          <w:p>
-            <w:pPr>
-              <w:keepNext w:val="0"/>
-              <w:keepLines w:val="0"/>
-              <w:pageBreakBefore w:val="0"/>
-              <w:widowControl w:val="0"/>
-              <w:pBdr>
-                <w:top w:space="0" w:sz="0" w:val="nil"/>
-                <w:left w:space="0" w:sz="0" w:val="nil"/>
-                <w:bottom w:space="0" w:sz="0" w:val="nil"/>
-                <w:right w:space="0" w:sz="0" w:val="nil"/>
-                <w:between w:space="0" w:sz="0" w:val="nil"/>
-              </w:pBdr>
-              <w:shd w:fill="auto" w:val="clear"/>
-              <w:spacing w:after="0" w:before="0" w:line="240" w:lineRule="auto"/>
-              <w:ind w:left="0" w:right="0" w:firstLine="0"/>
-              <w:jc w:val="left"/>
-              <w:rPr/>
-            </w:pPr>
-            <w:r>
-              <w:rPr>
-                <w:rtl w:val="0"/>
-              </w:rPr>
+              <w:t xml:space="preserve">Current Array Generator Plan uses far more memory than necessary </w:t>
+            </w:r>
+          </w:p>
+        </w:tc>
+        <w:tc>
+          <w:tcPr>
+            <w:shd w:fill="auto" w:val="clear"/>
+            <w:tcMar>
+              <w:top w:w="100.0" w:type="dxa"/>
+              <w:left w:w="100.0" w:type="dxa"/>
+              <w:bottom w:w="100.0" w:type="dxa"/>
+              <w:right w:w="100.0" w:type="dxa"/>
+            </w:tcMar>
+            <w:vAlign w:val="top"/>
+          </w:tcPr>
+          <w:p>
+            <w:pPr>
+              <w:keepNext w:val="0"/>
+              <w:keepLines w:val="0"/>
+              <w:pageBreakBefore w:val="0"/>
+              <w:widowControl w:val="0"/>
+              <w:pBdr>
+                <w:top w:space="0" w:sz="0" w:val="nil"/>
+                <w:left w:space="0" w:sz="0" w:val="nil"/>
+                <w:bottom w:space="0" w:sz="0" w:val="nil"/>
+                <w:right w:space="0" w:sz="0" w:val="nil"/>
+                <w:between w:space="0" w:sz="0" w:val="nil"/>
+              </w:pBdr>
+              <w:shd w:fill="auto" w:val="clear"/>
+              <w:spacing w:after="0" w:before="0" w:line="240" w:lineRule="auto"/>
+              <w:ind w:left="0" w:right="0" w:firstLine="0"/>
+              <w:jc w:val="left"/>
+              <w:rPr/>
+            </w:pPr>
+            <w:r>
+              <w:rPr>
+                <w:rtl w:val="0"/>
+              </w:rPr>
+              <w:t xml:space="preserve">Severe with larger values</w:t>
+            </w:r>
+          </w:p>
+        </w:tc>
+        <w:tc>
+          <w:tcPr>
+            <w:shd w:fill="auto" w:val="clear"/>
+            <w:tcMar>
+              <w:top w:w="100.0" w:type="dxa"/>
+              <w:left w:w="100.0" w:type="dxa"/>
+              <w:bottom w:w="100.0" w:type="dxa"/>
+              <w:right w:w="100.0" w:type="dxa"/>
+            </w:tcMar>
+            <w:vAlign w:val="top"/>
+          </w:tcPr>
+          <w:p>
+            <w:pPr>
+              <w:keepNext w:val="0"/>
+              <w:keepLines w:val="0"/>
+              <w:pageBreakBefore w:val="0"/>
+              <w:widowControl w:val="0"/>
+              <w:pBdr>
+                <w:top w:space="0" w:sz="0" w:val="nil"/>
+                <w:left w:space="0" w:sz="0" w:val="nil"/>
+                <w:bottom w:space="0" w:sz="0" w:val="nil"/>
+                <w:right w:space="0" w:sz="0" w:val="nil"/>
+                <w:between w:space="0" w:sz="0" w:val="nil"/>
+              </w:pBdr>
+              <w:shd w:fill="auto" w:val="clear"/>
+              <w:spacing w:after="0" w:before="0" w:line="240" w:lineRule="auto"/>
+              <w:ind w:left="0" w:right="0" w:firstLine="0"/>
+              <w:jc w:val="left"/>
+              <w:rPr/>
+            </w:pPr>
+            <w:r>
+              <w:rPr>
+                <w:rtl w:val="0"/>
+              </w:rPr>
+              <w:t xml:space="preserve">Redo UML and change the plan for how the arrays are created in the Main Method</w:t>
+            </w:r>
+          </w:p>
+        </w:tc>
+        <w:tc>
+          <w:tcPr>
+            <w:shd w:fill="auto" w:val="clear"/>
+            <w:tcMar>
+              <w:top w:w="100.0" w:type="dxa"/>
+              <w:left w:w="100.0" w:type="dxa"/>
+              <w:bottom w:w="100.0" w:type="dxa"/>
+              <w:right w:w="100.0" w:type="dxa"/>
+            </w:tcMar>
+            <w:vAlign w:val="top"/>
+          </w:tcPr>
+          <w:p>
+            <w:pPr>
+              <w:keepNext w:val="0"/>
+              <w:keepLines w:val="0"/>
+              <w:pageBreakBefore w:val="0"/>
+              <w:widowControl w:val="0"/>
+              <w:pBdr>
+                <w:top w:space="0" w:sz="0" w:val="nil"/>
+                <w:left w:space="0" w:sz="0" w:val="nil"/>
+                <w:bottom w:space="0" w:sz="0" w:val="nil"/>
+                <w:right w:space="0" w:sz="0" w:val="nil"/>
+                <w:between w:space="0" w:sz="0" w:val="nil"/>
+              </w:pBdr>
+              <w:shd w:fill="auto" w:val="clear"/>
+              <w:spacing w:after="0" w:before="0" w:line="240" w:lineRule="auto"/>
+              <w:ind w:left="0" w:right="0" w:firstLine="0"/>
+              <w:jc w:val="left"/>
+              <w:rPr/>
+            </w:pPr>
+            <w:r>
+              <w:rPr>
+                <w:rtl w:val="0"/>
+              </w:rPr>
+              <w:t xml:space="preserve">Spencer </w:t>
+            </w:r>
+          </w:p>
+        </w:tc>
+        <w:tc>
+          <w:tcPr>
+            <w:shd w:fill="auto" w:val="clear"/>
+            <w:tcMar>
+              <w:top w:w="100.0" w:type="dxa"/>
+              <w:left w:w="100.0" w:type="dxa"/>
+              <w:bottom w:w="100.0" w:type="dxa"/>
+              <w:right w:w="100.0" w:type="dxa"/>
+            </w:tcMar>
+            <w:vAlign w:val="top"/>
+          </w:tcPr>
+          <w:p>
+            <w:pPr>
+              <w:keepNext w:val="0"/>
+              <w:keepLines w:val="0"/>
+              <w:pageBreakBefore w:val="0"/>
+              <w:widowControl w:val="0"/>
+              <w:pBdr>
+                <w:top w:space="0" w:sz="0" w:val="nil"/>
+                <w:left w:space="0" w:sz="0" w:val="nil"/>
+                <w:bottom w:space="0" w:sz="0" w:val="nil"/>
+                <w:right w:space="0" w:sz="0" w:val="nil"/>
+                <w:between w:space="0" w:sz="0" w:val="nil"/>
+              </w:pBdr>
+              <w:shd w:fill="auto" w:val="clear"/>
+              <w:spacing w:after="0" w:before="0" w:line="240" w:lineRule="auto"/>
+              <w:ind w:left="0" w:right="0" w:firstLine="0"/>
+              <w:jc w:val="left"/>
+              <w:rPr/>
+            </w:pPr>
+            <w:r>
+              <w:rPr>
+                <w:rtl w:val="0"/>
+              </w:rPr>
+              <w:t xml:space="preserve">Done</w:t>
             </w:r>
           </w:p>
         </w:tc>
@@ -4801,6 +4807,200 @@
               <w:rPr>
                 <w:rtl w:val="0"/>
               </w:rPr>
+            </w:r>
+          </w:p>
+        </w:tc>
+        <w:tc>
+          <w:tcPr>
+            <w:shd w:fill="auto" w:val="clear"/>
+            <w:tcMar>
+              <w:top w:w="100.0" w:type="dxa"/>
+              <w:left w:w="100.0" w:type="dxa"/>
+              <w:bottom w:w="100.0" w:type="dxa"/>
+              <w:right w:w="100.0" w:type="dxa"/>
+            </w:tcMar>
+            <w:vAlign w:val="top"/>
+          </w:tcPr>
+          <w:p>
+            <w:pPr>
+              <w:keepNext w:val="0"/>
+              <w:keepLines w:val="0"/>
+              <w:pageBreakBefore w:val="0"/>
+              <w:widowControl w:val="0"/>
+              <w:pBdr>
+                <w:top w:space="0" w:sz="0" w:val="nil"/>
+                <w:left w:space="0" w:sz="0" w:val="nil"/>
+                <w:bottom w:space="0" w:sz="0" w:val="nil"/>
+                <w:right w:space="0" w:sz="0" w:val="nil"/>
+                <w:between w:space="0" w:sz="0" w:val="nil"/>
+              </w:pBdr>
+              <w:shd w:fill="auto" w:val="clear"/>
+              <w:spacing w:after="0" w:before="0" w:line="240" w:lineRule="auto"/>
+              <w:ind w:left="0" w:right="0" w:firstLine="0"/>
+              <w:jc w:val="left"/>
+              <w:rPr/>
+            </w:pPr>
+            <w:r>
+              <w:rPr>
+                <w:rtl w:val="0"/>
+              </w:rPr>
+            </w:r>
+          </w:p>
+        </w:tc>
+        <w:tc>
+          <w:tcPr>
+            <w:shd w:fill="auto" w:val="clear"/>
+            <w:tcMar>
+              <w:top w:w="100.0" w:type="dxa"/>
+              <w:left w:w="100.0" w:type="dxa"/>
+              <w:bottom w:w="100.0" w:type="dxa"/>
+              <w:right w:w="100.0" w:type="dxa"/>
+            </w:tcMar>
+            <w:vAlign w:val="top"/>
+          </w:tcPr>
+          <w:p>
+            <w:pPr>
+              <w:keepNext w:val="0"/>
+              <w:keepLines w:val="0"/>
+              <w:pageBreakBefore w:val="0"/>
+              <w:widowControl w:val="0"/>
+              <w:pBdr>
+                <w:top w:space="0" w:sz="0" w:val="nil"/>
+                <w:left w:space="0" w:sz="0" w:val="nil"/>
+                <w:bottom w:space="0" w:sz="0" w:val="nil"/>
+                <w:right w:space="0" w:sz="0" w:val="nil"/>
+                <w:between w:space="0" w:sz="0" w:val="nil"/>
+              </w:pBdr>
+              <w:shd w:fill="auto" w:val="clear"/>
+              <w:spacing w:after="0" w:before="0" w:line="240" w:lineRule="auto"/>
+              <w:ind w:left="0" w:right="0" w:firstLine="0"/>
+              <w:jc w:val="left"/>
+              <w:rPr/>
+            </w:pPr>
+            <w:r>
+              <w:rPr>
+                <w:rtl w:val="0"/>
+              </w:rPr>
+            </w:r>
+          </w:p>
+        </w:tc>
+      </w:tr>
+      <w:tr>
+        <w:trPr>
+          <w:cantSplit w:val="0"/>
+          <w:tblHeader w:val="0"/>
+        </w:trPr>
+        <w:tc>
+          <w:tcPr>
+            <w:shd w:fill="auto" w:val="clear"/>
+            <w:tcMar>
+              <w:top w:w="100.0" w:type="dxa"/>
+              <w:left w:w="100.0" w:type="dxa"/>
+              <w:bottom w:w="100.0" w:type="dxa"/>
+              <w:right w:w="100.0" w:type="dxa"/>
+            </w:tcMar>
+            <w:vAlign w:val="top"/>
+          </w:tcPr>
+          <w:p>
+            <w:pPr>
+              <w:keepNext w:val="0"/>
+              <w:keepLines w:val="0"/>
+              <w:pageBreakBefore w:val="0"/>
+              <w:widowControl w:val="0"/>
+              <w:pBdr>
+                <w:top w:space="0" w:sz="0" w:val="nil"/>
+                <w:left w:space="0" w:sz="0" w:val="nil"/>
+                <w:bottom w:space="0" w:sz="0" w:val="nil"/>
+                <w:right w:space="0" w:sz="0" w:val="nil"/>
+                <w:between w:space="0" w:sz="0" w:val="nil"/>
+              </w:pBdr>
+              <w:shd w:fill="auto" w:val="clear"/>
+              <w:spacing w:after="0" w:before="0" w:line="240" w:lineRule="auto"/>
+              <w:ind w:left="0" w:right="0" w:firstLine="0"/>
+              <w:jc w:val="left"/>
+              <w:rPr/>
+            </w:pPr>
+            <w:r>
+              <w:rPr>
+                <w:rtl w:val="0"/>
+              </w:rPr>
+              <w:t xml:space="preserve">2/11/2026</w:t>
+            </w:r>
+          </w:p>
+        </w:tc>
+        <w:tc>
+          <w:tcPr>
+            <w:shd w:fill="auto" w:val="clear"/>
+            <w:tcMar>
+              <w:top w:w="100.0" w:type="dxa"/>
+              <w:left w:w="100.0" w:type="dxa"/>
+              <w:bottom w:w="100.0" w:type="dxa"/>
+              <w:right w:w="100.0" w:type="dxa"/>
+            </w:tcMar>
+            <w:vAlign w:val="top"/>
+          </w:tcPr>
+          <w:p>
+            <w:pPr>
+              <w:keepNext w:val="0"/>
+              <w:keepLines w:val="0"/>
+              <w:pageBreakBefore w:val="0"/>
+              <w:widowControl w:val="0"/>
+              <w:pBdr>
+                <w:top w:space="0" w:sz="0" w:val="nil"/>
+                <w:left w:space="0" w:sz="0" w:val="nil"/>
+                <w:bottom w:space="0" w:sz="0" w:val="nil"/>
+                <w:right w:space="0" w:sz="0" w:val="nil"/>
+                <w:between w:space="0" w:sz="0" w:val="nil"/>
+              </w:pBdr>
+              <w:shd w:fill="auto" w:val="clear"/>
+              <w:spacing w:after="0" w:before="0" w:line="240" w:lineRule="auto"/>
+              <w:ind w:left="0" w:right="0" w:firstLine="0"/>
+              <w:jc w:val="left"/>
+              <w:rPr/>
+            </w:pPr>
+            <w:r>
+              <w:rPr>
+                <w:rtl w:val="0"/>
+              </w:rPr>
+              <w:t xml:space="preserve">Updated project statuses</w:t>
+            </w:r>
+          </w:p>
+        </w:tc>
+        <w:tc>
+          <w:tcPr>
+            <w:shd w:fill="auto" w:val="clear"/>
+            <w:tcMar>
+              <w:top w:w="100.0" w:type="dxa"/>
+              <w:left w:w="100.0" w:type="dxa"/>
+              <w:bottom w:w="100.0" w:type="dxa"/>
+              <w:right w:w="100.0" w:type="dxa"/>
+            </w:tcMar>
+            <w:vAlign w:val="top"/>
+          </w:tcPr>
+          <w:p>
+            <w:pPr>
+              <w:keepNext w:val="0"/>
+              <w:keepLines w:val="0"/>
+              <w:pageBreakBefore w:val="0"/>
+              <w:widowControl w:val="0"/>
+              <w:pBdr>
+                <w:top w:space="0" w:sz="0" w:val="nil"/>
+                <w:left w:space="0" w:sz="0" w:val="nil"/>
+                <w:bottom w:space="0" w:sz="0" w:val="nil"/>
+                <w:right w:space="0" w:sz="0" w:val="nil"/>
+                <w:between w:space="0" w:sz="0" w:val="nil"/>
+              </w:pBdr>
+              <w:shd w:fill="auto" w:val="clear"/>
+              <w:spacing w:after="0" w:before="0" w:line="240" w:lineRule="auto"/>
+              <w:ind w:left="0" w:right="0" w:firstLine="0"/>
+              <w:jc w:val="left"/>
+              <w:rPr/>
+            </w:pPr>
+            <w:r>
+              <w:rPr>
+                <w:rtl w:val="0"/>
+              </w:rPr>
+              <w:t xml:space="preserve">ArrayGenerator Memory- Created/Fixed</w:t>
             </w:r>
           </w:p>
         </w:tc>

</xml_diff>